<commit_message>
chore: untrack CLA.docx (Office metadata, covered by *.docx gitignore)
</commit_message>
<xml_diff>
--- a/CLA.docx
+++ b/CLA.docx
@@ -982,7 +982,7 @@
       </w:r>
     </w:p>
     <w:sectPr>
-      <w:headerReference w:type="default" r:id="rId10"/>
+      <w:headerReference w:type="default" r:id="rId11"/>
       <w:footerReference w:type="default" r:id="rId8"/>
       <w:pgSz w:w="12240" w:h="15840" w:orient="portrait"/>
       <w:pgMar w:top="1440" w:right="1440" w:bottom="1440" w:left="1440" w:header="708" w:footer="708" w:gutter="0"/>
@@ -1225,6 +1225,87 @@
 </w:hdr>
 </file>
 
+<file path=word/header_watermark.xml><?xml version="1.0" encoding="utf-8"?>
+<w:hdr xmlns:w="http://schemas.openxmlformats.org/wordprocessingml/2006/main" xmlns:r="http://schemas.openxmlformats.org/officeDocument/2006/relationships" xmlns:wp="http://schemas.openxmlformats.org/drawingml/2006/wordprocessingDrawing" xmlns:a="http://schemas.openxmlformats.org/drawingml/2006/main" xmlns:wps="http://schemas.microsoft.com/office/word/2010/wordprocessingShape" xmlns:mc="http://schemas.openxmlformats.org/markup-compatibility/2006" xmlns:wp14="http://schemas.microsoft.com/office/word/2010/wordprocessingDrawing" xmlns:w14="http://schemas.microsoft.com/office/word/2010/wordml" mc:Ignorable="w14 wp14">
+  <w:p>
+    <w:pPr>
+      <w:pStyle w:val="Header"/>
+    </w:pPr>
+    <w:r>
+      <w:rPr>
+        <w:noProof/>
+      </w:rPr>
+      <mc:AlternateContent>
+        <mc:Choice Requires="wps">
+          <w:drawing>
+            <wp:anchor distT="0" distB="0" distL="0" distR="0" simplePos="0" relativeHeight="251658240" behindDoc="1" locked="0" layoutInCell="0" allowOverlap="1">
+              <wp:simplePos x="0" y="0"/>
+              <wp:positionH relativeFrom="page">
+                <wp:align>right</wp:align>
+              </wp:positionH>
+              <wp:positionV relativeFrom="page">
+                <wp:align>bottom</wp:align>
+              </wp:positionV>
+              <wp:extent cx="2200000" cy="350000"/>
+              <wp:effectExtent l="0" t="0" r="0" b="0"/>
+              <wp:wrapNone/>
+              <wp:docPr id="1" name="Watermark"/>
+              <a:graphic>
+                <a:graphicData uri="http://schemas.microsoft.com/office/word/2010/wordprocessingShape">
+                  <wps:wsp>
+                    <wps:cNvSpPr txBox="1"/>
+                    <wps:spPr>
+                      <a:xfrm rot="0">
+                        <a:off x="0" y="0"/>
+                        <a:ext cx="2200000" cy="350000"/>
+                      </a:xfrm>
+                      <a:prstGeom prst="rect">
+                        <a:avLst/>
+                      </a:prstGeom>
+                      <a:noFill/>
+                      <a:ln>
+                        <a:noFill/>
+                      </a:ln>
+                    </wps:spPr>
+                    <wps:txbx>
+                      <w:txbxContent>
+                        <w:p>
+                          <w:pPr>
+                            <w:jc w:val="right"/>
+                          </w:pPr>
+                          <w:r>
+                            <w:rPr>
+                              <w:sz w:val="32"/>
+                              <w:szCs w:val="32"/>
+                              <w:rFonts w:eastAsia="SimSun" w:ascii="Arial" w:hAnsi="Arial"/>
+                              <w:color w:val="808080"/>
+                              <w14:textFill>
+                                <w14:solidFill>
+                                  <w14:srgbClr w14:val="808080">
+                                    <w14:alpha w14:val="19999"/>
+                                  </w14:srgbClr>
+                                </w14:solidFill>
+                              </w14:textFill>
+                            </w:rPr>
+                            <w:t>AI 生成</w:t>
+                          </w:r>
+                        </w:p>
+                      </w:txbxContent>
+                    </wps:txbx>
+                    <wps:bodyPr wrap="square" anchor="b" anchorCtr="0" lIns="0" tIns="0" rIns="91440" bIns="45720"/>
+                  </wps:wsp>
+                </a:graphicData>
+              </a:graphic>
+            </wp:anchor>
+          </w:drawing>
+        </mc:Choice>
+        <mc:Fallback/>
+      </mc:AlternateContent>
+    </w:r>
+  </w:p>
+</w:hdr>
+</file>
+
 <file path=word/numbering.xml><?xml version="1.0" encoding="utf-8"?>
 <w:numbering xmlns:wpc="http://schemas.microsoft.com/office/word/2010/wordprocessingCanvas" xmlns:mc="http://schemas.openxmlformats.org/markup-compatibility/2006" xmlns:o="urn:schemas-microsoft-com:office:office" xmlns:r="http://schemas.openxmlformats.org/officeDocument/2006/relationships" xmlns:m="http://schemas.openxmlformats.org/officeDocument/2006/math" xmlns:v="urn:schemas-microsoft-com:vml" xmlns:wp14="http://schemas.microsoft.com/office/word/2010/wordprocessingDrawing" xmlns:wp="http://schemas.openxmlformats.org/drawingml/2006/wordprocessingDrawing" xmlns:w10="urn:schemas-microsoft-com:office:word" xmlns:w="http://schemas.openxmlformats.org/wordprocessingml/2006/main" xmlns:w14="http://schemas.microsoft.com/office/word/2010/wordml" xmlns:w15="http://schemas.microsoft.com/office/word/2012/wordml" xmlns:wpg="http://schemas.microsoft.com/office/word/2010/wordprocessingGroup" xmlns:wpi="http://schemas.microsoft.com/office/word/2010/wordprocessingInk" xmlns:wne="http://schemas.microsoft.com/office/word/2006/wordml" xmlns:wps="http://schemas.microsoft.com/office/word/2010/wordprocessingShape" mc:Ignorable="w14 w15 wp14">
   <w:abstractNum w:abstractNumId="1" w15:restartNumberingAfterBreak="0">

</xml_diff>